<commit_message>
Update v5 doc: correct Phase 13-16 roadmap based on code review
</commit_message>
<xml_diff>
--- a/AI_Advisory_Master_Architecture_v5.docx
+++ b/AI_Advisory_Master_Architecture_v5.docx
@@ -4946,8 +4946,23 @@
       </w:r>
     </w:p>
     <w:p>
+      <w:pPr/>
       <w:r>
-        <w:t>Phases 1–12 are complete. Planned next phases:</w:t>
+        <w:t>Phases 1–12 are complete. The following phases are scoped based on what is actually missing from the current system — verified against the codebase.</w:t>
+      </w:r>
+    </w:p>
+    <w:p>
+      <w:pPr>
+        <w:pStyle w:val="Heading2"/>
+      </w:pPr>
+      <w:r>
+        <w:t>Phase 13 — Complete the chatbot → simulation data gap</w:t>
+      </w:r>
+    </w:p>
+    <w:p>
+      <w:pPr/>
+      <w:r>
+        <w:t>The simulation engine already uses risk_score to query the frontier and income_preference to split capital between AnchorIncomeEngine and the model portfolio. But the chatbot does not yet collect everything needed:</w:t>
       </w:r>
     </w:p>
     <w:p>
@@ -4955,7 +4970,7 @@
         <w:pStyle w:val="ListBullet"/>
       </w:pPr>
       <w:r>
-        <w:t>Phase 13 — Persistent session storage: replace InMemorySessionService with a database-backed session store so conversations survive server restarts.</w:t>
+        <w:t>income_preference: derive from risk_score_final in handleSimulate — conservative (low score) = high income weight, aggressive (high score) = low income weight. Currently hardcoded at 50.</w:t>
       </w:r>
     </w:p>
     <w:p>
@@ -4963,7 +4978,7 @@
         <w:pStyle w:val="ListBullet"/>
       </w:pPr>
       <w:r>
-        <w:t>Phase 14 — Additional onboarding agents: portfolio_optimizer_gatherer and income_strategy_gatherer sub-agents following the same escalation pattern.</w:t>
+        <w:t>horizon_years: chatbot never asks. Hardcoded at 1 year. Add as a question in position_gatherer ("How many years are you planning for?").</w:t>
       </w:r>
     </w:p>
     <w:p>
@@ -4971,7 +4986,49 @@
         <w:pStyle w:val="ListBullet"/>
       </w:pPr>
       <w:r>
-        <w:t>Phase 15 — Chatbot narrator for returning users: the orchestrator generates the daily status bar sentence and morning briefing for the LoginCard.</w:t>
+        <w:t>tlh_inventory: existing tax loss balance, hardcoded at $250,000. Ask in position_gatherer or default to 0 (correct for most new clients).</w:t>
+      </w:r>
+    </w:p>
+    <w:p>
+      <w:pPr>
+        <w:pStyle w:val="Heading2"/>
+      </w:pPr>
+      <w:r>
+        <w:t>Phase 14 — Persistent sessions + returning user experience</w:t>
+      </w:r>
+    </w:p>
+    <w:p>
+      <w:pPr/>
+      <w:r>
+        <w:t>InMemorySessionService resets on every server restart — users must re-onboard. Replace with a SQLite-backed session store (consistent with existing db/price_store.py pattern). Returning users skip onboarding and land directly on their status dashboard. The orchestrator detects a returning session (risk_assessment_complete + position_data_complete already True in state) and skips to the LoginCard.</w:t>
+      </w:r>
+    </w:p>
+    <w:p>
+      <w:pPr>
+        <w:pStyle w:val="Heading2"/>
+      </w:pPr>
+      <w:r>
+        <w:t>Phase 15 — Chatbot narrator for returning users</w:t>
+      </w:r>
+    </w:p>
+    <w:p>
+      <w:pPr/>
+      <w:r>
+        <w:t>The LoginCard status bar currently shows a rule-based sentence. Replace with an LLM-generated morning briefing: the orchestrator reads the last monthly_intelligence entry and produces a warm, personalised 1-sentence status bar and a 2–3 paragraph briefing with 3 suggestion chips. This reuses the existing /chat endpoint with a special "briefing" message type.</w:t>
+      </w:r>
+    </w:p>
+    <w:p>
+      <w:pPr>
+        <w:pStyle w:val="Heading2"/>
+      </w:pPr>
+      <w:r>
+        <w:t>Phase 16 — Additional onboarding agents</w:t>
+      </w:r>
+    </w:p>
+    <w:p>
+      <w:pPr/>
+      <w:r>
+        <w:t>Extend the agent hierarchy with two new sub-agents following the same escalation pattern:</w:t>
       </w:r>
     </w:p>
     <w:p>
@@ -4979,7 +5036,21 @@
         <w:pStyle w:val="ListBullet"/>
       </w:pPr>
       <w:r>
-        <w:t>Phase 16 — Frontier-driven rebalancing: connect risk_score_final from agent session to the frontier service for live portfolio allocation.</w:t>
+        <w:t>portfolio_optimizer_gatherer: walks the user through rebalancing preferences — target allocation, rebalancing frequency, tax constraints.</w:t>
+      </w:r>
+    </w:p>
+    <w:p>
+      <w:pPr>
+        <w:pStyle w:val="ListBullet"/>
+      </w:pPr>
+      <w:r>
+        <w:t>income_strategy_gatherer: discusses target yield, preferred income instruments, whether to use covered calls on the concentrated position during the unwind.</w:t>
+      </w:r>
+    </w:p>
+    <w:p>
+      <w:pPr/>
+      <w:r>
+        <w:t>Both agents write to state_keys.py slots and escalate back to the orchestrator, which chains them in sequence after position_gatherer completes.</w:t>
       </w:r>
     </w:p>
     <w:p>

</xml_diff>